<commit_message>
refactor: html for walidator
</commit_message>
<xml_diff>
--- a/assets/other/Ссылки на проекты.docx
+++ b/assets/other/Ссылки на проекты.docx
@@ -1,14 +1,46 @@
 
 <file path=word/document.xml><?xml version="1.0" encoding="utf-8"?>
-<w:document xmlns:wpc="http://schemas.microsoft.com/office/word/2010/wordprocessingCanvas" xmlns:cx="http://schemas.microsoft.com/office/drawing/2014/chartex" xmlns:cx1="http://schemas.microsoft.com/office/drawing/2015/9/8/chartex" xmlns:cx2="http://schemas.microsoft.com/office/drawing/2015/10/21/chartex" xmlns:cx3="http://schemas.microsoft.com/office/drawing/2016/5/9/chartex" xmlns:cx4="http://schemas.microsoft.com/office/drawing/2016/5/10/chartex" xmlns:cx5="http://schemas.microsoft.com/office/drawing/2016/5/11/chartex" xmlns:cx6="http://schemas.microsoft.com/office/drawing/2016/5/12/chartex" xmlns:cx7="http://schemas.microsoft.com/office/drawing/2016/5/13/chartex" xmlns:cx8="http://schemas.microsoft.com/office/drawing/2016/5/14/chartex" xmlns:mc="http://schemas.openxmlformats.org/markup-compatibility/2006" xmlns:aink="http://schemas.microsoft.com/office/drawing/2016/ink" xmlns:am3d="http://schemas.microsoft.com/office/drawing/2017/model3d" xmlns:o="urn:schemas-microsoft-com:office:office" xmlns:r="http://schemas.openxmlformats.org/officeDocument/2006/relationships" xmlns:m="http://schemas.openxmlformats.org/officeDocument/2006/math" xmlns:v="urn:schemas-microsoft-com:vml" xmlns:wp14="http://schemas.microsoft.com/office/word/2010/wordprocessingDrawing" xmlns:wp="http://schemas.openxmlformats.org/drawingml/2006/wordprocessingDrawing" xmlns:w10="urn:schemas-microsoft-com:office:word" xmlns:w="http://schemas.openxmlformats.org/wordprocessingml/2006/main" xmlns:w14="http://schemas.microsoft.com/office/word/2010/wordml" xmlns:w15="http://schemas.microsoft.com/office/word/2012/wordml" xmlns:w16cex="http://schemas.microsoft.com/office/word/2018/wordml/cex" xmlns:w16cid="http://schemas.microsoft.com/office/word/2016/wordml/cid" xmlns:w16="http://schemas.microsoft.com/office/word/2018/wordml" xmlns:w16se="http://schemas.microsoft.com/office/word/2015/wordml/symex" xmlns:wpg="http://schemas.microsoft.com/office/word/2010/wordprocessingGroup" xmlns:wpi="http://schemas.microsoft.com/office/word/2010/wordprocessingInk" xmlns:wne="http://schemas.microsoft.com/office/word/2006/wordml" xmlns:wps="http://schemas.microsoft.com/office/word/2010/wordprocessingShape" mc:Ignorable="w14 w15 w16se w16cid w16 w16cex wp14">
+<w:document xmlns:wpc="http://schemas.microsoft.com/office/word/2010/wordprocessingCanvas" xmlns:cx="http://schemas.microsoft.com/office/drawing/2014/chartex" xmlns:cx1="http://schemas.microsoft.com/office/drawing/2015/9/8/chartex" xmlns:cx2="http://schemas.microsoft.com/office/drawing/2015/10/21/chartex" xmlns:cx3="http://schemas.microsoft.com/office/drawing/2016/5/9/chartex" xmlns:cx4="http://schemas.microsoft.com/office/drawing/2016/5/10/chartex" xmlns:cx5="http://schemas.microsoft.com/office/drawing/2016/5/11/chartex" xmlns:cx6="http://schemas.microsoft.com/office/drawing/2016/5/12/chartex" xmlns:cx7="http://schemas.microsoft.com/office/drawing/2016/5/13/chartex" xmlns:cx8="http://schemas.microsoft.com/office/drawing/2016/5/14/chartex" xmlns:mc="http://schemas.openxmlformats.org/markup-compatibility/2006" xmlns:aink="http://schemas.microsoft.com/office/drawing/2016/ink" xmlns:am3d="http://schemas.microsoft.com/office/drawing/2017/model3d" xmlns:o="urn:schemas-microsoft-com:office:office" xmlns:oel="http://schemas.microsoft.com/office/2019/extlst" xmlns:r="http://schemas.openxmlformats.org/officeDocument/2006/relationships" xmlns:m="http://schemas.openxmlformats.org/officeDocument/2006/math" xmlns:v="urn:schemas-microsoft-com:vml" xmlns:wp14="http://schemas.microsoft.com/office/word/2010/wordprocessingDrawing" xmlns:wp="http://schemas.openxmlformats.org/drawingml/2006/wordprocessingDrawing" xmlns:w10="urn:schemas-microsoft-com:office:word" xmlns:w="http://schemas.openxmlformats.org/wordprocessingml/2006/main" xmlns:w14="http://schemas.microsoft.com/office/word/2010/wordml" xmlns:w15="http://schemas.microsoft.com/office/word/2012/wordml" xmlns:w16cex="http://schemas.microsoft.com/office/word/2018/wordml/cex" xmlns:w16cid="http://schemas.microsoft.com/office/word/2016/wordml/cid" xmlns:w16="http://schemas.microsoft.com/office/word/2018/wordml" xmlns:w16du="http://schemas.microsoft.com/office/word/2023/wordml/word16du" xmlns:w16sdtdh="http://schemas.microsoft.com/office/word/2020/wordml/sdtdatahash" xmlns:w16sdtfl="http://schemas.microsoft.com/office/word/2024/wordml/sdtformatlock" xmlns:w16se="http://schemas.microsoft.com/office/word/2015/wordml/symex" xmlns:wpg="http://schemas.microsoft.com/office/word/2010/wordprocessingGroup" xmlns:wpi="http://schemas.microsoft.com/office/word/2010/wordprocessingInk" xmlns:wne="http://schemas.microsoft.com/office/word/2006/wordml" xmlns:wps="http://schemas.microsoft.com/office/word/2010/wordprocessingShape" mc:Ignorable="w14 w15 w16se w16cid w16 w16cex w16sdtdh w16sdtfl w16du wp14">
   <w:body>
     <w:p>
+      <w:r>
+        <w:fldChar w:fldCharType="begin"/>
+      </w:r>
+      <w:r>
+        <w:instrText>HYPERLINK "https://dromari.github.io/momentum/momentum"</w:instrText>
+      </w:r>
+      <w:r>
+        <w:fldChar w:fldCharType="separate"/>
+      </w:r>
+      <w:r>
+        <w:rPr>
+          <w:rStyle w:val="a3"/>
+        </w:rPr>
+        <w:t>https://dromari.github.io/momentum/</w:t>
+      </w:r>
+      <w:r>
+        <w:rPr>
+          <w:rStyle w:val="a3"/>
+        </w:rPr>
+        <w:t>m</w:t>
+      </w:r>
+      <w:r>
+        <w:rPr>
+          <w:rStyle w:val="a3"/>
+        </w:rPr>
+        <w:t>omentum</w:t>
+      </w:r>
+      <w:r>
+        <w:fldChar w:fldCharType="end"/>
+      </w:r>
+    </w:p>
+    <w:p>
       <w:hyperlink r:id="rId4" w:history="1">
         <w:r>
           <w:rPr>
             <w:rStyle w:val="a3"/>
           </w:rPr>
-          <w:t>https://dromari.github.io/momentum/momentum</w:t>
+          <w:t>https://dromari.github.io/travel/travel</w:t>
         </w:r>
       </w:hyperlink>
     </w:p>
@@ -18,7 +50,7 @@
           <w:rPr>
             <w:rStyle w:val="a3"/>
           </w:rPr>
-          <w:t>https://dromari.github.io/travel/travel</w:t>
+          <w:t>https://dromari.github.io/online-zoo/online-zoo/pages/main/</w:t>
         </w:r>
       </w:hyperlink>
     </w:p>
@@ -28,7 +60,224 @@
           <w:rPr>
             <w:rStyle w:val="a3"/>
           </w:rPr>
-          <w:t>https://dromari.github.io/online-zoo/online-zoo/pages/main/</w:t>
+          <w:t>https://dromari.github.io/eldritch-codejam/</w:t>
+        </w:r>
+      </w:hyperlink>
+    </w:p>
+    <w:p/>
+    <w:p>
+      <w:pPr>
+        <w:rPr>
+          <w:lang w:val="en-US"/>
+        </w:rPr>
+      </w:pPr>
+      <w:hyperlink r:id="rId7" w:history="1">
+        <w:r>
+          <w:rPr>
+            <w:rStyle w:val="a3"/>
+            <w:lang w:val="en-US"/>
+          </w:rPr>
+          <w:t>https</w:t>
+        </w:r>
+        <w:r>
+          <w:rPr>
+            <w:rStyle w:val="a3"/>
+          </w:rPr>
+          <w:t>://</w:t>
+        </w:r>
+        <w:r>
+          <w:rPr>
+            <w:rStyle w:val="a3"/>
+            <w:lang w:val="en-US"/>
+          </w:rPr>
+          <w:t>rolling</w:t>
+        </w:r>
+        <w:r>
+          <w:rPr>
+            <w:rStyle w:val="a3"/>
+          </w:rPr>
+          <w:t>-</w:t>
+        </w:r>
+        <w:r>
+          <w:rPr>
+            <w:rStyle w:val="a3"/>
+            <w:lang w:val="en-US"/>
+          </w:rPr>
+          <w:t>scopes</w:t>
+        </w:r>
+        <w:r>
+          <w:rPr>
+            <w:rStyle w:val="a3"/>
+          </w:rPr>
+          <w:t>-</w:t>
+        </w:r>
+        <w:r>
+          <w:rPr>
+            <w:rStyle w:val="a3"/>
+            <w:lang w:val="en-US"/>
+          </w:rPr>
+          <w:t>school</w:t>
+        </w:r>
+        <w:r>
+          <w:rPr>
+            <w:rStyle w:val="a3"/>
+          </w:rPr>
+          <w:t>.</w:t>
+        </w:r>
+        <w:proofErr w:type="spellStart"/>
+        <w:r>
+          <w:rPr>
+            <w:rStyle w:val="a3"/>
+            <w:lang w:val="en-US"/>
+          </w:rPr>
+          <w:t>github</w:t>
+        </w:r>
+        <w:proofErr w:type="spellEnd"/>
+        <w:r>
+          <w:rPr>
+            <w:rStyle w:val="a3"/>
+          </w:rPr>
+          <w:t>.</w:t>
+        </w:r>
+        <w:r>
+          <w:rPr>
+            <w:rStyle w:val="a3"/>
+            <w:lang w:val="en-US"/>
+          </w:rPr>
+          <w:t>io</w:t>
+        </w:r>
+        <w:r>
+          <w:rPr>
+            <w:rStyle w:val="a3"/>
+          </w:rPr>
+          <w:t>/</w:t>
+        </w:r>
+        <w:proofErr w:type="spellStart"/>
+        <w:r>
+          <w:rPr>
+            <w:rStyle w:val="a3"/>
+            <w:lang w:val="en-US"/>
+          </w:rPr>
+          <w:t>dromari</w:t>
+        </w:r>
+        <w:proofErr w:type="spellEnd"/>
+        <w:r>
+          <w:rPr>
+            <w:rStyle w:val="a3"/>
+          </w:rPr>
+          <w:t>-</w:t>
+        </w:r>
+        <w:r>
+          <w:rPr>
+            <w:rStyle w:val="a3"/>
+            <w:lang w:val="en-US"/>
+          </w:rPr>
+          <w:t>JSFE</w:t>
+        </w:r>
+        <w:r>
+          <w:rPr>
+            <w:rStyle w:val="a3"/>
+          </w:rPr>
+          <w:t>2024</w:t>
+        </w:r>
+        <w:r>
+          <w:rPr>
+            <w:rStyle w:val="a3"/>
+            <w:lang w:val="en-US"/>
+          </w:rPr>
+          <w:t>Q</w:t>
+        </w:r>
+        <w:r>
+          <w:rPr>
+            <w:rStyle w:val="a3"/>
+          </w:rPr>
+          <w:t>4/</w:t>
+        </w:r>
+        <w:proofErr w:type="spellStart"/>
+        <w:r>
+          <w:rPr>
+            <w:rStyle w:val="a3"/>
+            <w:lang w:val="en-US"/>
+          </w:rPr>
+          <w:t>christmas</w:t>
+        </w:r>
+        <w:proofErr w:type="spellEnd"/>
+        <w:r>
+          <w:rPr>
+            <w:rStyle w:val="a3"/>
+          </w:rPr>
+          <w:t>-</w:t>
+        </w:r>
+        <w:r>
+          <w:rPr>
+            <w:rStyle w:val="a3"/>
+            <w:lang w:val="en-US"/>
+          </w:rPr>
+          <w:t>shop</w:t>
+        </w:r>
+        <w:r>
+          <w:rPr>
+            <w:rStyle w:val="a3"/>
+          </w:rPr>
+          <w:t>/</w:t>
+        </w:r>
+        <w:r>
+          <w:rPr>
+            <w:rStyle w:val="a3"/>
+            <w:lang w:val="en-US"/>
+          </w:rPr>
+          <w:t>pages</w:t>
+        </w:r>
+        <w:r>
+          <w:rPr>
+            <w:rStyle w:val="a3"/>
+          </w:rPr>
+          <w:t>/</w:t>
+        </w:r>
+        <w:r>
+          <w:rPr>
+            <w:rStyle w:val="a3"/>
+            <w:lang w:val="en-US"/>
+          </w:rPr>
+          <w:t>home</w:t>
+        </w:r>
+        <w:r>
+          <w:rPr>
+            <w:rStyle w:val="a3"/>
+          </w:rPr>
+          <w:t>/</w:t>
+        </w:r>
+      </w:hyperlink>
+    </w:p>
+    <w:p>
+      <w:pPr>
+        <w:rPr>
+          <w:lang w:val="en-US"/>
+        </w:rPr>
+      </w:pPr>
+      <w:hyperlink r:id="rId8" w:history="1">
+        <w:r>
+          <w:rPr>
+            <w:rStyle w:val="a3"/>
+            <w:lang w:val="en-US"/>
+          </w:rPr>
+          <w:t>https://dromari.github.io/library/library/index.html</w:t>
+        </w:r>
+      </w:hyperlink>
+    </w:p>
+    <w:p>
+      <w:pPr>
+        <w:rPr>
+          <w:lang w:val="en-US"/>
+        </w:rPr>
+      </w:pPr>
+      <w:hyperlink r:id="rId9" w:history="1">
+        <w:r>
+          <w:rPr>
+            <w:rStyle w:val="a3"/>
+            <w:lang w:val="en-US"/>
+          </w:rPr>
+          <w:t>https://dromari.github.io/cssMemeSlider/cssMemeSlider/index.html</w:t>
         </w:r>
       </w:hyperlink>
     </w:p>
@@ -39,9 +288,27 @@
         </w:rPr>
       </w:pPr>
       <w:r>
-        <w:t>https://dromari.github.io/eldritch-codejam/</w:t>
+        <w:rPr>
+          <w:lang w:val="en-US"/>
+        </w:rPr>
+        <w:t>https://dromari.github.io/coffee-house/coffee-house/pages/home/</w:t>
       </w:r>
     </w:p>
+    <w:p>
+      <w:pPr>
+        <w:rPr>
+          <w:lang w:val="en-US"/>
+        </w:rPr>
+      </w:pPr>
+    </w:p>
+    <w:p>
+      <w:pPr>
+        <w:rPr>
+          <w:lang w:val="en-US"/>
+        </w:rPr>
+      </w:pPr>
+    </w:p>
+    <w:p/>
     <w:sectPr>
       <w:pgSz w:w="11906" w:h="16838"/>
       <w:pgMar w:top="1134" w:right="850" w:bottom="1134" w:left="1701" w:header="708" w:footer="708" w:gutter="0"/>
@@ -53,7 +320,7 @@
 </file>
 
 <file path=word/styles.xml><?xml version="1.0" encoding="utf-8"?>
-<w:styles xmlns:mc="http://schemas.openxmlformats.org/markup-compatibility/2006" xmlns:r="http://schemas.openxmlformats.org/officeDocument/2006/relationships" xmlns:w="http://schemas.openxmlformats.org/wordprocessingml/2006/main" xmlns:w14="http://schemas.microsoft.com/office/word/2010/wordml" xmlns:w15="http://schemas.microsoft.com/office/word/2012/wordml" xmlns:w16cex="http://schemas.microsoft.com/office/word/2018/wordml/cex" xmlns:w16cid="http://schemas.microsoft.com/office/word/2016/wordml/cid" xmlns:w16="http://schemas.microsoft.com/office/word/2018/wordml" xmlns:w16se="http://schemas.microsoft.com/office/word/2015/wordml/symex" mc:Ignorable="w14 w15 w16se w16cid w16 w16cex">
+<w:styles xmlns:mc="http://schemas.openxmlformats.org/markup-compatibility/2006" xmlns:r="http://schemas.openxmlformats.org/officeDocument/2006/relationships" xmlns:w="http://schemas.openxmlformats.org/wordprocessingml/2006/main" xmlns:w14="http://schemas.microsoft.com/office/word/2010/wordml" xmlns:w15="http://schemas.microsoft.com/office/word/2012/wordml" xmlns:w16cex="http://schemas.microsoft.com/office/word/2018/wordml/cex" xmlns:w16cid="http://schemas.microsoft.com/office/word/2016/wordml/cid" xmlns:w16="http://schemas.microsoft.com/office/word/2018/wordml" xmlns:w16du="http://schemas.microsoft.com/office/word/2023/wordml/word16du" xmlns:w16sdtdh="http://schemas.microsoft.com/office/word/2020/wordml/sdtdatahash" xmlns:w16sdtfl="http://schemas.microsoft.com/office/word/2024/wordml/sdtformatlock" xmlns:w16se="http://schemas.microsoft.com/office/word/2015/wordml/symex" mc:Ignorable="w14 w15 w16se w16cid w16 w16cex w16sdtdh w16sdtfl w16du">
   <w:docDefaults>
     <w:rPrDefault>
       <w:rPr>
@@ -454,7 +721,6 @@
   <w:style w:type="character" w:default="1" w:styleId="a0">
     <w:name w:val="Default Paragraph Font"/>
     <w:uiPriority w:val="1"/>
-    <w:semiHidden/>
     <w:unhideWhenUsed/>
   </w:style>
   <w:style w:type="table" w:default="1" w:styleId="a1">
@@ -499,6 +765,18 @@
     <w:rPr>
       <w:color w:val="605E5C"/>
       <w:shd w:val="clear" w:color="auto" w:fill="E1DFDD"/>
+    </w:rPr>
+  </w:style>
+  <w:style w:type="character" w:styleId="a5">
+    <w:name w:val="FollowedHyperlink"/>
+    <w:basedOn w:val="a0"/>
+    <w:uiPriority w:val="99"/>
+    <w:semiHidden/>
+    <w:unhideWhenUsed/>
+    <w:rsid w:val="00E13D7B"/>
+    <w:rPr>
+      <w:color w:val="954F72" w:themeColor="followedHyperlink"/>
+      <w:u w:val="single"/>
     </w:rPr>
   </w:style>
 </w:styles>

</xml_diff>